<commit_message>
Gabor and noise injection
</commit_message>
<xml_diff>
--- a/decoding-analysis/revision_memos/meeting notes.docx
+++ b/decoding-analysis/revision_memos/meeting notes.docx
@@ -3295,14 +3295,7 @@
           <w:b/>
           <w:bCs/>
         </w:rPr>
-        <w:t xml:space="preserve">1. </w:t>
-      </w:r>
-      <w:r>
-        <w:rPr>
-          <w:b/>
-          <w:bCs/>
-        </w:rPr>
-        <w:t>Regenerate figures with correct controls</w:t>
+        <w:t>1. Regenerate figures with correct controls</w:t>
       </w:r>
     </w:p>
     <w:p>
@@ -3319,6 +3312,52 @@
         </w:rPr>
         <w:t>2. Simulations with injected noise?</w:t>
       </w:r>
+    </w:p>
+    <w:p>
+      <w:pPr>
+        <w:rPr>
+          <w:b/>
+          <w:bCs/>
+        </w:rPr>
+      </w:pPr>
+    </w:p>
+    <w:p>
+      <w:pPr>
+        <w:rPr>
+          <w:b/>
+          <w:bCs/>
+        </w:rPr>
+      </w:pPr>
+      <w:r>
+        <w:rPr>
+          <w:b/>
+          <w:bCs/>
+        </w:rPr>
+        <w:t>10.18.2026</w:t>
+      </w:r>
+    </w:p>
+    <w:p>
+      <w:pPr>
+        <w:rPr>
+          <w:b/>
+          <w:bCs/>
+        </w:rPr>
+      </w:pPr>
+      <w:r>
+        <w:rPr>
+          <w:b/>
+          <w:bCs/>
+        </w:rPr>
+        <w:t>Injected noise of different levels into simulations</w:t>
+      </w:r>
+    </w:p>
+    <w:p>
+      <w:pPr>
+        <w:rPr>
+          <w:b/>
+          <w:bCs/>
+        </w:rPr>
+      </w:pPr>
     </w:p>
     <w:sectPr>
       <w:pgSz w:w="12240" w:h="15840"/>

</xml_diff>